<commit_message>
Drop the nine At-Level-7 boxes from the path rewards (DM call)
The doors read better without the ledger summaries; the feature text
carries what is live and the formulas carry the growth. Compendium
volumes, all three v3 handouts, and the book PDF rebuilt.

Co-Authored-By: Claude Opus 4.8 <noreply@anthropic.com>
</commit_message>
<xml_diff>
--- a/characters/path_rewards/glimmerstone_artifacts_v3.docx
+++ b/characters/path_rewards/glimmerstone_artifacts_v3.docx
@@ -739,95 +739,6 @@
     <w:p>
       <w:pPr>
         <w:keepNext/>
-        <w:pBdr>
-          <w:top w:val="double" w:sz="12" w:space="4" w:color="1F7A78"/>
-          <w:left w:val="double" w:sz="12" w:space="10" w:color="1F7A78"/>
-          <w:right w:val="double" w:sz="12" w:space="10" w:color="1F7A78"/>
-        </w:pBdr>
-        <w:shd w:val="clear" w:color="auto" w:fill="EAF4F3"/>
-        <w:spacing w:before="280" w:after="60"/>
-        <w:ind w:left="400" w:right="400"/>
-        <w:jc w:val="center"/>
-      </w:pPr>
-      <w:r>
-        <w:rPr>
-          <w:rFonts w:ascii="Georgia" w:hAnsi="Georgia" w:cs="Georgia"/>
-          <w:b/>
-          <w:color w:val="1F7A78"/>
-          <w:sz w:val="27"/>
-        </w:rPr>
-        <w:t>✦  At Level 7, Boomstick Has  ✦</w:t>
-      </w:r>
-    </w:p>
-    <w:p>
-      <w:pPr>
-        <w:keepNext/>
-        <w:keepLines/>
-        <w:pBdr>
-          <w:left w:val="double" w:sz="12" w:space="10" w:color="1F7A78"/>
-          <w:right w:val="double" w:sz="12" w:space="10" w:color="1F7A78"/>
-        </w:pBdr>
-        <w:shd w:val="clear" w:color="auto" w:fill="EAF4F3"/>
-        <w:spacing w:before="0" w:after="0"/>
-        <w:ind w:left="400" w:right="400"/>
-      </w:pPr>
-      <w:r>
-        <w:rPr>
-          <w:rFonts w:ascii="Georgia" w:hAnsi="Georgia" w:cs="Georgia"/>
-          <w:b/>
-          <w:i w:val="0"/>
-          <w:color w:val="222222"/>
-          <w:sz w:val="21"/>
-        </w:rPr>
-        <w:t>Live now:</w:t>
-      </w:r>
-      <w:r>
-        <w:rPr>
-          <w:rFonts w:ascii="Georgia" w:hAnsi="Georgia" w:cs="Georgia"/>
-          <w:b w:val="0"/>
-          <w:i w:val="0"/>
-          <w:color w:val="222222"/>
-          <w:sz w:val="21"/>
-        </w:rPr>
-        <w:t xml:space="preserve"> everything. The +2 pistol with its bottomless clockwork drum, +2 to spell attack rolls (a bonus that reaches her Eldritch Cannon's attacks too), ignored Half Cover on spell attacks, the 1d8 Thunder Arcane Firearm rider, the Concussion boom that steals Reactions, and True Strike channeled through the barrel.</w:t>
-      </w:r>
-    </w:p>
-    <w:p>
-      <w:pPr>
-        <w:keepLines/>
-        <w:pBdr>
-          <w:bottom w:val="double" w:sz="12" w:space="4" w:color="1F7A78"/>
-          <w:left w:val="double" w:sz="12" w:space="10" w:color="1F7A78"/>
-          <w:right w:val="double" w:sz="12" w:space="10" w:color="1F7A78"/>
-        </w:pBdr>
-        <w:shd w:val="clear" w:color="auto" w:fill="EAF4F3"/>
-        <w:spacing w:before="0" w:after="280"/>
-        <w:ind w:left="400" w:right="400"/>
-      </w:pPr>
-      <w:r>
-        <w:rPr>
-          <w:rFonts w:ascii="Georgia" w:hAnsi="Georgia" w:cs="Georgia"/>
-          <w:b/>
-          <w:i w:val="0"/>
-          <w:color w:val="222222"/>
-          <w:sz w:val="21"/>
-        </w:rPr>
-        <w:t>Not yet:</w:t>
-      </w:r>
-      <w:r>
-        <w:rPr>
-          <w:rFonts w:ascii="Georgia" w:hAnsi="Georgia" w:cs="Georgia"/>
-          <w:b w:val="0"/>
-          <w:i w:val="0"/>
-          <w:color w:val="222222"/>
-          <w:sz w:val="21"/>
-        </w:rPr>
-        <w:t xml:space="preserve"> nothing held back. Boomstick arrives complete, and this door pays its whole price on day one; what grows from here is only the legend.</w:t>
-      </w:r>
-    </w:p>
-    <w:p>
-      <w:pPr>
-        <w:keepNext/>
         <w:pageBreakBefore/>
         <w:spacing w:before="220" w:after="60"/>
       </w:pPr>
@@ -1270,95 +1181,6 @@
           <w:sz w:val="18"/>
         </w:rPr>
         <w:t xml:space="preserve"> As a Magic action, you can expend 1 use to target one creature within 60 feet of yourself. The target must make a Constitution saving throw, taking 8d6 Necrotic damage on a failed save or half as much damage on a successful one. You, or one ally within 30 feet of you, regains a number of Hit Points equal to half the Necrotic damage dealt.</w:t>
-      </w:r>
-    </w:p>
-    <w:p>
-      <w:pPr>
-        <w:keepNext/>
-        <w:pBdr>
-          <w:top w:val="double" w:sz="12" w:space="4" w:color="1F7A78"/>
-          <w:left w:val="double" w:sz="12" w:space="10" w:color="1F7A78"/>
-          <w:right w:val="double" w:sz="12" w:space="10" w:color="1F7A78"/>
-        </w:pBdr>
-        <w:shd w:val="clear" w:color="auto" w:fill="EAF4F3"/>
-        <w:spacing w:before="280" w:after="60"/>
-        <w:ind w:left="400" w:right="400"/>
-        <w:jc w:val="center"/>
-      </w:pPr>
-      <w:r>
-        <w:rPr>
-          <w:rFonts w:ascii="Georgia" w:hAnsi="Georgia" w:cs="Georgia"/>
-          <w:b/>
-          <w:color w:val="1F7A78"/>
-          <w:sz w:val="27"/>
-        </w:rPr>
-        <w:t>✦  At Level 7, the Awakened Essence Sphere Has  ✦</w:t>
-      </w:r>
-    </w:p>
-    <w:p>
-      <w:pPr>
-        <w:keepNext/>
-        <w:keepLines/>
-        <w:pBdr>
-          <w:left w:val="double" w:sz="12" w:space="10" w:color="1F7A78"/>
-          <w:right w:val="double" w:sz="12" w:space="10" w:color="1F7A78"/>
-        </w:pBdr>
-        <w:shd w:val="clear" w:color="auto" w:fill="EAF4F3"/>
-        <w:spacing w:before="0" w:after="0"/>
-        <w:ind w:left="400" w:right="400"/>
-      </w:pPr>
-      <w:r>
-        <w:rPr>
-          <w:rFonts w:ascii="Georgia" w:hAnsi="Georgia" w:cs="Georgia"/>
-          <w:b/>
-          <w:i w:val="0"/>
-          <w:color w:val="222222"/>
-          <w:sz w:val="21"/>
-        </w:rPr>
-        <w:t>Live now:</w:t>
-      </w:r>
-      <w:r>
-        <w:rPr>
-          <w:rFonts w:ascii="Georgia" w:hAnsi="Georgia" w:cs="Georgia"/>
-          <w:b w:val="0"/>
-          <w:i w:val="0"/>
-          <w:color w:val="222222"/>
-          <w:sz w:val="21"/>
-        </w:rPr>
-        <w:t xml:space="preserve"> Aether Ward, twice per Short Rest: Lilly and each ally within 15 feet gain 2d8 + her Intelligence modifier Temporary Hit Points.</w:t>
-      </w:r>
-    </w:p>
-    <w:p>
-      <w:pPr>
-        <w:keepLines/>
-        <w:pBdr>
-          <w:bottom w:val="double" w:sz="12" w:space="4" w:color="1F7A78"/>
-          <w:left w:val="double" w:sz="12" w:space="10" w:color="1F7A78"/>
-          <w:right w:val="double" w:sz="12" w:space="10" w:color="1F7A78"/>
-        </w:pBdr>
-        <w:shd w:val="clear" w:color="auto" w:fill="EAF4F3"/>
-        <w:spacing w:before="0" w:after="280"/>
-        <w:ind w:left="400" w:right="400"/>
-      </w:pPr>
-      <w:r>
-        <w:rPr>
-          <w:rFonts w:ascii="Georgia" w:hAnsi="Georgia" w:cs="Georgia"/>
-          <w:b/>
-          <w:i w:val="0"/>
-          <w:color w:val="222222"/>
-          <w:sz w:val="21"/>
-        </w:rPr>
-        <w:t>Not yet:</w:t>
-      </w:r>
-      <w:r>
-        <w:rPr>
-          <w:rFonts w:ascii="Georgia" w:hAnsi="Georgia" w:cs="Georgia"/>
-          <w:b w:val="0"/>
-          <w:i w:val="0"/>
-          <w:color w:val="222222"/>
-          <w:sz w:val="21"/>
-        </w:rPr>
-        <w:t xml:space="preserve"> all five discharges. A fire nova (Cinderstorm), a lull that stills a warband (the Drowning Lull), a tailwind at every ally's back (Tailwind), the ground turned weapon (Tectonic Slam), and a shadow's hungry pull (Soul Siphon) each wake only when their rift falls and its Mote comes home. Five rifts stand between this Sphere and its full voice, and it means to earn every one.</w:t>
       </w:r>
     </w:p>
     <w:p>
@@ -2141,95 +1963,6 @@
         <w:t xml:space="preserve"> The old cannon made Lilly choose a mode; the Sentinel walks on its own 30 feet, then blasts or pulses on her Bonus Action (her pick every time), and shields her friends as a Reaction in the same round. Her old kit lives on inside it: the Force Ballista became the Force Blast, the Storm mode became the Electric Pulse, and the Protector stands watch as Guardian Protocol. The Flamethrower was traded for lightning, Gearhaven's own element. Forged by the masters of Glimmerstone.</w:t>
       </w:r>
     </w:p>
-    <w:p>
-      <w:pPr>
-        <w:keepNext/>
-        <w:pBdr>
-          <w:top w:val="double" w:sz="12" w:space="4" w:color="1F7A78"/>
-          <w:left w:val="double" w:sz="12" w:space="10" w:color="1F7A78"/>
-          <w:right w:val="double" w:sz="12" w:space="10" w:color="1F7A78"/>
-        </w:pBdr>
-        <w:shd w:val="clear" w:color="auto" w:fill="EAF4F3"/>
-        <w:spacing w:before="280" w:after="60"/>
-        <w:ind w:left="400" w:right="400"/>
-        <w:jc w:val="center"/>
-      </w:pPr>
-      <w:r>
-        <w:rPr>
-          <w:rFonts w:ascii="Georgia" w:hAnsi="Georgia" w:cs="Georgia"/>
-          <w:b/>
-          <w:color w:val="1F7A78"/>
-          <w:sz w:val="27"/>
-        </w:rPr>
-        <w:t>✦  At Level 7, the Sentinel Has  ✦</w:t>
-      </w:r>
-    </w:p>
-    <w:p>
-      <w:pPr>
-        <w:keepNext/>
-        <w:keepLines/>
-        <w:pBdr>
-          <w:left w:val="double" w:sz="12" w:space="10" w:color="1F7A78"/>
-          <w:right w:val="double" w:sz="12" w:space="10" w:color="1F7A78"/>
-        </w:pBdr>
-        <w:shd w:val="clear" w:color="auto" w:fill="EAF4F3"/>
-        <w:spacing w:before="0" w:after="0"/>
-        <w:ind w:left="400" w:right="400"/>
-      </w:pPr>
-      <w:r>
-        <w:rPr>
-          <w:rFonts w:ascii="Georgia" w:hAnsi="Georgia" w:cs="Georgia"/>
-          <w:b/>
-          <w:i w:val="0"/>
-          <w:color w:val="222222"/>
-          <w:sz w:val="21"/>
-        </w:rPr>
-        <w:t>Live now:</w:t>
-      </w:r>
-      <w:r>
-        <w:rPr>
-          <w:rFonts w:ascii="Georgia" w:hAnsi="Georgia" w:cs="Georgia"/>
-          <w:b w:val="0"/>
-          <w:i w:val="0"/>
-          <w:color w:val="222222"/>
-          <w:sz w:val="21"/>
-        </w:rPr>
-        <w:t xml:space="preserve"> the whole statblock. 40 Hit Points behind AC 18, its own 30 feet of Speed, Force Blast or Electric Pulse on her Bonus Action (her pick every round), Guardian Protocol once per round, and a free attunement slot besides, since the Dynamo lives on inside the frame.</w:t>
-      </w:r>
-    </w:p>
-    <w:p>
-      <w:pPr>
-        <w:keepLines/>
-        <w:pBdr>
-          <w:bottom w:val="double" w:sz="12" w:space="4" w:color="1F7A78"/>
-          <w:left w:val="double" w:sz="12" w:space="10" w:color="1F7A78"/>
-          <w:right w:val="double" w:sz="12" w:space="10" w:color="1F7A78"/>
-        </w:pBdr>
-        <w:shd w:val="clear" w:color="auto" w:fill="EAF4F3"/>
-        <w:spacing w:before="0" w:after="280"/>
-        <w:ind w:left="400" w:right="400"/>
-      </w:pPr>
-      <w:r>
-        <w:rPr>
-          <w:rFonts w:ascii="Georgia" w:hAnsi="Georgia" w:cs="Georgia"/>
-          <w:b/>
-          <w:i w:val="0"/>
-          <w:color w:val="222222"/>
-          <w:sz w:val="21"/>
-        </w:rPr>
-        <w:t>Not yet:</w:t>
-      </w:r>
-      <w:r>
-        <w:rPr>
-          <w:rFonts w:ascii="Georgia" w:hAnsi="Georgia" w:cs="Georgia"/>
-          <w:b w:val="0"/>
-          <w:i w:val="0"/>
-          <w:color w:val="222222"/>
-          <w:sz w:val="21"/>
-        </w:rPr>
-        <w:t xml:space="preserve"> its Hit Points keep pace with her, 5 + five times her Artificer level, so the guardian grows sturdier every time Lilly does.</w:t>
-      </w:r>
-    </w:p>
     <w:sectPr>
       <w:footerReference w:type="default" r:id="rId9"/>
       <w:pgSz w:w="12240" w:h="15840"/>

</xml_diff>

<commit_message>
Bigger door art across the Three Doors run (DM directive)
Stabby's three breathing-style floats grow to 3.0; the Nichirin
Katana and both of Ursa's door plates (the Warden's Mantle, the
Dreamed Day) are promoted from side floats to full-width showcase
plates with captions. The run grows 16 to 18 pages with every page
above 58% coverage except the intentional Elaria showpiece.
Compendium volumes, handouts, and book rebuilt.

Co-Authored-By: Claude Opus 4.8 <noreply@anthropic.com>
</commit_message>
<xml_diff>
--- a/characters/path_rewards/glimmerstone_artifacts_v3.docx
+++ b/characters/path_rewards/glimmerstone_artifacts_v3.docx
@@ -394,6 +394,62 @@
     <w:p>
       <w:pPr>
         <w:keepNext/>
+        <w:spacing w:before="120" w:after="40"/>
+        <w:jc w:val="center"/>
+      </w:pPr>
+      <w:r>
+        <w:drawing>
+          <wp:inline xmlns:a="http://schemas.openxmlformats.org/drawingml/2006/main" xmlns:pic="http://schemas.openxmlformats.org/drawingml/2006/picture">
+            <wp:extent cx="5303520" cy="3531260"/>
+            <wp:docPr id="4" name="Picture 4"/>
+            <wp:cNvGraphicFramePr>
+              <a:graphicFrameLocks noChangeAspect="1"/>
+            </wp:cNvGraphicFramePr>
+            <a:graphic>
+              <a:graphicData uri="http://schemas.openxmlformats.org/drawingml/2006/picture">
+                <pic:pic>
+                  <pic:nvPicPr>
+                    <pic:cNvPr id="0" name="image.jpg"/>
+                    <pic:cNvPicPr/>
+                  </pic:nvPicPr>
+                  <pic:blipFill>
+                    <a:blip r:embed="rId13"/>
+                    <a:stretch>
+                      <a:fillRect/>
+                    </a:stretch>
+                  </pic:blipFill>
+                  <pic:spPr>
+                    <a:xfrm>
+                      <a:off x="0" y="0"/>
+                      <a:ext cx="5303520" cy="3531260"/>
+                    </a:xfrm>
+                    <a:prstGeom prst="rect"/>
+                  </pic:spPr>
+                </pic:pic>
+              </a:graphicData>
+            </a:graphic>
+          </wp:inline>
+        </w:drawing>
+      </w:r>
+    </w:p>
+    <w:p>
+      <w:pPr>
+        <w:spacing w:after="140"/>
+        <w:jc w:val="center"/>
+      </w:pPr>
+      <w:r>
+        <w:rPr>
+          <w:rFonts w:ascii="Georgia" w:hAnsi="Georgia" w:cs="Georgia"/>
+          <w:i/>
+          <w:color w:val="888888"/>
+          <w:sz w:val="18"/>
+        </w:rPr>
+        <w:t>The parting at Gearhaven's gates: three friends, three roads, one year.</w:t>
+      </w:r>
+    </w:p>
+    <w:p>
+      <w:pPr>
+        <w:keepNext/>
         <w:pageBreakBefore/>
         <w:spacing w:before="400" w:after="120"/>
         <w:pBdr>
@@ -462,7 +518,7 @@
             <wp:extent cx="2011680" cy="2011680"/>
             <wp:effectExtent l="0" t="0" r="0" b="0"/>
             <wp:wrapSquare wrapText="bothSides"/>
-            <wp:docPr id="4" name="Picture 4"/>
+            <wp:docPr id="5" name="Picture 5"/>
             <wp:cNvGraphicFramePr/>
             <a:graphic xmlns:pic="http://schemas.openxmlformats.org/drawingml/2006/picture">
               <a:graphicData uri="http://schemas.openxmlformats.org/drawingml/2006/picture">
@@ -472,7 +528,7 @@
                     <pic:cNvPicPr/>
                   </pic:nvPicPr>
                   <pic:blipFill>
-                    <a:blip r:embed="rId13"/>
+                    <a:blip r:embed="rId14"/>
                     <a:stretch>
                       <a:fillRect/>
                     </a:stretch>
@@ -769,7 +825,7 @@
             <wp:extent cx="2194560" cy="2194560"/>
             <wp:effectExtent l="0" t="0" r="0" b="0"/>
             <wp:wrapSquare wrapText="bothSides"/>
-            <wp:docPr id="5" name="Picture 5"/>
+            <wp:docPr id="6" name="Picture 6"/>
             <wp:cNvGraphicFramePr/>
             <a:graphic xmlns:pic="http://schemas.openxmlformats.org/drawingml/2006/picture">
               <a:graphicData uri="http://schemas.openxmlformats.org/drawingml/2006/picture">
@@ -779,7 +835,7 @@
                     <pic:cNvPicPr/>
                   </pic:nvPicPr>
                   <pic:blipFill>
-                    <a:blip r:embed="rId14"/>
+                    <a:blip r:embed="rId15"/>
                     <a:stretch>
                       <a:fillRect/>
                     </a:stretch>
@@ -1242,7 +1298,7 @@
             <wp:extent cx="2148840" cy="2148840"/>
             <wp:effectExtent l="0" t="0" r="0" b="0"/>
             <wp:wrapSquare wrapText="bothSides"/>
-            <wp:docPr id="6" name="Picture 6"/>
+            <wp:docPr id="7" name="Picture 7"/>
             <wp:cNvGraphicFramePr/>
             <a:graphic xmlns:pic="http://schemas.openxmlformats.org/drawingml/2006/picture">
               <a:graphicData uri="http://schemas.openxmlformats.org/drawingml/2006/picture">
@@ -1252,7 +1308,7 @@
                     <pic:cNvPicPr/>
                   </pic:nvPicPr>
                   <pic:blipFill>
-                    <a:blip r:embed="rId15"/>
+                    <a:blip r:embed="rId16"/>
                     <a:stretch>
                       <a:fillRect/>
                     </a:stretch>

</xml_diff>

<commit_message>
Handouts open directly on each hero's path (DM directive)
The shared Three Doors intro was duplicated into all three player
handouts; it belongs to the Compendium's flow only. Each handout is
now titlepage + that hero's section. All three rebuilt.

Co-Authored-By: Claude Opus 4.8 <noreply@anthropic.com>
</commit_message>
<xml_diff>
--- a/characters/path_rewards/glimmerstone_artifacts_v3.docx
+++ b/characters/path_rewards/glimmerstone_artifacts_v3.docx
@@ -78,378 +78,6 @@
     <w:p>
       <w:pPr>
         <w:keepNext/>
-        <w:spacing w:before="400" w:after="120"/>
-        <w:pBdr>
-          <w:bottom w:val="single" w:sz="6" w:space="4" w:color="B8860B"/>
-        </w:pBdr>
-      </w:pPr>
-      <w:r>
-        <w:rPr>
-          <w:rFonts w:ascii="Georgia" w:hAnsi="Georgia" w:cs="Georgia"/>
-          <w:b/>
-          <w:color w:val="B8860B"/>
-          <w:sz w:val="32"/>
-        </w:rPr>
-        <w:t>The Three Doors</w:t>
-      </w:r>
-    </w:p>
-    <w:p>
-      <w:pPr>
-        <w:pBdr>
-          <w:left w:val="single" w:sz="18" w:space="12" w:color="B8860B"/>
-        </w:pBdr>
-        <w:shd w:val="clear" w:color="auto" w:fill="FBF6EA"/>
-        <w:spacing w:before="30" w:after="70"/>
-        <w:ind w:left="340" w:right="340"/>
-      </w:pPr>
-      <w:r>
-        <w:rPr>
-          <w:rFonts w:ascii="Georgia" w:hAnsi="Georgia" w:cs="Georgia"/>
-          <w:b w:val="0"/>
-          <w:i w:val="0"/>
-          <w:color w:val="222222"/>
-          <w:sz w:val="21"/>
-        </w:rPr>
-        <w:t>At the close of the Gearhaven chapter the Guardians parted for a year: a year of workshops and roads and night skies, each hero following their own heart home. Before each of them stand three doors, three ways that year apart might be spent, and behind every door waits a different gift.</w:t>
-      </w:r>
-    </w:p>
-    <w:p>
-      <w:pPr>
-        <w:spacing w:after="80"/>
-      </w:pPr>
-      <w:r>
-        <w:rPr>
-          <w:rFonts w:ascii="Georgia" w:hAnsi="Georgia" w:cs="Georgia"/>
-          <w:b w:val="0"/>
-          <w:i w:val="0"/>
-          <w:color w:val="222222"/>
-          <w:sz w:val="21"/>
-        </w:rPr>
-        <w:t>The chapters that follow set down what waits behind all nine: Stabby's three breathing styles, Ursa's three paths of the stars, and Lilly's three artifacts. Each Guardian will choose exactly one door, and none of the three has chosen yet. When they do, the doors not taken will remain in these pages, roads not walked, ready for other heroes in other tellings.</w:t>
-      </w:r>
-    </w:p>
-    <w:tbl>
-      <w:tblPr>
-        <w:tblW w:type="auto" w:w="0"/>
-        <w:jc w:val="center"/>
-        <w:tblLayout w:type="fixed"/>
-        <w:tblLook w:firstColumn="1" w:firstRow="1" w:lastColumn="0" w:lastRow="0" w:noHBand="0" w:noVBand="1" w:val="04A0"/>
-        <w:tblCellMar>
-          <w:left w:w="0" w:type="dxa"/>
-          <w:right w:w="0" w:type="dxa"/>
-        </w:tblCellMar>
-      </w:tblPr>
-      <w:tblGrid>
-        <w:gridCol w:w="3120"/>
-        <w:gridCol w:w="3120"/>
-        <w:gridCol w:w="3120"/>
-      </w:tblGrid>
-      <w:tr>
-        <w:tc>
-          <w:tcPr>
-            <w:tcW w:type="dxa" w:w="3120"/>
-          </w:tcPr>
-          <w:p>
-            <w:pPr>
-              <w:jc w:val="center"/>
-            </w:pPr>
-            <w:r>
-              <w:drawing>
-                <wp:inline xmlns:a="http://schemas.openxmlformats.org/drawingml/2006/main" xmlns:pic="http://schemas.openxmlformats.org/drawingml/2006/picture">
-                  <wp:extent cx="1783080" cy="1783080"/>
-                  <wp:docPr id="1" name="Picture 1"/>
-                  <wp:cNvGraphicFramePr>
-                    <a:graphicFrameLocks noChangeAspect="1"/>
-                  </wp:cNvGraphicFramePr>
-                  <a:graphic>
-                    <a:graphicData uri="http://schemas.openxmlformats.org/drawingml/2006/picture">
-                      <pic:pic>
-                        <pic:nvPicPr>
-                          <pic:cNvPr id="0" name="image.jpg"/>
-                          <pic:cNvPicPr/>
-                        </pic:nvPicPr>
-                        <pic:blipFill>
-                          <a:blip r:embed="rId10"/>
-                          <a:stretch>
-                            <a:fillRect/>
-                          </a:stretch>
-                        </pic:blipFill>
-                        <pic:spPr>
-                          <a:xfrm>
-                            <a:off x="0" y="0"/>
-                            <a:ext cx="1783080" cy="1783080"/>
-                          </a:xfrm>
-                          <a:prstGeom prst="rect"/>
-                        </pic:spPr>
-                      </pic:pic>
-                    </a:graphicData>
-                  </a:graphic>
-                </wp:inline>
-              </w:drawing>
-            </w:r>
-          </w:p>
-        </w:tc>
-        <w:tc>
-          <w:tcPr>
-            <w:tcW w:type="dxa" w:w="3120"/>
-          </w:tcPr>
-          <w:p>
-            <w:pPr>
-              <w:jc w:val="center"/>
-            </w:pPr>
-            <w:r>
-              <w:drawing>
-                <wp:inline xmlns:a="http://schemas.openxmlformats.org/drawingml/2006/main" xmlns:pic="http://schemas.openxmlformats.org/drawingml/2006/picture">
-                  <wp:extent cx="1783080" cy="1783080"/>
-                  <wp:docPr id="2" name="Picture 2"/>
-                  <wp:cNvGraphicFramePr>
-                    <a:graphicFrameLocks noChangeAspect="1"/>
-                  </wp:cNvGraphicFramePr>
-                  <a:graphic>
-                    <a:graphicData uri="http://schemas.openxmlformats.org/drawingml/2006/picture">
-                      <pic:pic>
-                        <pic:nvPicPr>
-                          <pic:cNvPr id="0" name="image.jpg"/>
-                          <pic:cNvPicPr/>
-                        </pic:nvPicPr>
-                        <pic:blipFill>
-                          <a:blip r:embed="rId11"/>
-                          <a:stretch>
-                            <a:fillRect/>
-                          </a:stretch>
-                        </pic:blipFill>
-                        <pic:spPr>
-                          <a:xfrm>
-                            <a:off x="0" y="0"/>
-                            <a:ext cx="1783080" cy="1783080"/>
-                          </a:xfrm>
-                          <a:prstGeom prst="rect"/>
-                        </pic:spPr>
-                      </pic:pic>
-                    </a:graphicData>
-                  </a:graphic>
-                </wp:inline>
-              </w:drawing>
-            </w:r>
-          </w:p>
-        </w:tc>
-        <w:tc>
-          <w:tcPr>
-            <w:tcW w:type="dxa" w:w="3120"/>
-          </w:tcPr>
-          <w:p>
-            <w:pPr>
-              <w:jc w:val="center"/>
-            </w:pPr>
-            <w:r>
-              <w:drawing>
-                <wp:inline xmlns:a="http://schemas.openxmlformats.org/drawingml/2006/main" xmlns:pic="http://schemas.openxmlformats.org/drawingml/2006/picture">
-                  <wp:extent cx="1783080" cy="1783080"/>
-                  <wp:docPr id="3" name="Picture 3"/>
-                  <wp:cNvGraphicFramePr>
-                    <a:graphicFrameLocks noChangeAspect="1"/>
-                  </wp:cNvGraphicFramePr>
-                  <a:graphic>
-                    <a:graphicData uri="http://schemas.openxmlformats.org/drawingml/2006/picture">
-                      <pic:pic>
-                        <pic:nvPicPr>
-                          <pic:cNvPr id="0" name="image.jpg"/>
-                          <pic:cNvPicPr/>
-                        </pic:nvPicPr>
-                        <pic:blipFill>
-                          <a:blip r:embed="rId12"/>
-                          <a:stretch>
-                            <a:fillRect/>
-                          </a:stretch>
-                        </pic:blipFill>
-                        <pic:spPr>
-                          <a:xfrm>
-                            <a:off x="0" y="0"/>
-                            <a:ext cx="1783080" cy="1783080"/>
-                          </a:xfrm>
-                          <a:prstGeom prst="rect"/>
-                        </pic:spPr>
-                      </pic:pic>
-                    </a:graphicData>
-                  </a:graphic>
-                </wp:inline>
-              </w:drawing>
-            </w:r>
-          </w:p>
-        </w:tc>
-      </w:tr>
-      <w:tr>
-        <w:tc>
-          <w:tcPr>
-            <w:tcW w:type="dxa" w:w="3120"/>
-          </w:tcPr>
-          <w:p>
-            <w:pPr>
-              <w:jc w:val="center"/>
-            </w:pPr>
-            <w:r>
-              <w:rPr>
-                <w:rFonts w:ascii="Georgia" w:hAnsi="Georgia" w:cs="Georgia"/>
-                <w:i/>
-                <w:color w:val="888888"/>
-                <w:sz w:val="18"/>
-              </w:rPr>
-              <w:t>Stabby, before the three breathing styles.</w:t>
-            </w:r>
-          </w:p>
-        </w:tc>
-        <w:tc>
-          <w:tcPr>
-            <w:tcW w:type="dxa" w:w="3120"/>
-          </w:tcPr>
-          <w:p>
-            <w:pPr>
-              <w:jc w:val="center"/>
-            </w:pPr>
-            <w:r>
-              <w:rPr>
-                <w:rFonts w:ascii="Georgia" w:hAnsi="Georgia" w:cs="Georgia"/>
-                <w:i/>
-                <w:color w:val="888888"/>
-                <w:sz w:val="18"/>
-              </w:rPr>
-              <w:t>Ursa, before the three paths of the stars.</w:t>
-            </w:r>
-          </w:p>
-        </w:tc>
-        <w:tc>
-          <w:tcPr>
-            <w:tcW w:type="dxa" w:w="3120"/>
-          </w:tcPr>
-          <w:p>
-            <w:pPr>
-              <w:jc w:val="center"/>
-            </w:pPr>
-            <w:r>
-              <w:rPr>
-                <w:rFonts w:ascii="Georgia" w:hAnsi="Georgia" w:cs="Georgia"/>
-                <w:i/>
-                <w:color w:val="888888"/>
-                <w:sz w:val="18"/>
-              </w:rPr>
-              <w:t>Lilly, before the three artifacts.</w:t>
-            </w:r>
-          </w:p>
-        </w:tc>
-      </w:tr>
-    </w:tbl>
-    <w:p>
-      <w:pPr>
-        <w:spacing w:after="80"/>
-      </w:pPr>
-    </w:p>
-    <w:p>
-      <w:pPr>
-        <w:keepNext/>
-        <w:spacing w:before="200" w:after="20"/>
-        <w:ind w:left="500" w:right="500"/>
-        <w:pBdr>
-          <w:top w:val="double" w:sz="6" w:space="4" w:color="1F4D78"/>
-        </w:pBdr>
-      </w:pPr>
-      <w:r>
-        <w:rPr>
-          <w:rFonts w:ascii="Georgia" w:hAnsi="Georgia" w:cs="Georgia"/>
-          <w:b/>
-          <w:color w:val="1F4D78"/>
-          <w:sz w:val="16"/>
-        </w:rPr>
-        <w:t xml:space="preserve">✦ LORE OF ELARIA ✦  </w:t>
-      </w:r>
-      <w:r>
-        <w:rPr>
-          <w:rFonts w:ascii="Georgia" w:hAnsi="Georgia" w:cs="Georgia"/>
-          <w:b/>
-          <w:color w:val="1F4D78"/>
-          <w:sz w:val="19"/>
-        </w:rPr>
-        <w:t>The Roads Not Taken</w:t>
-      </w:r>
-    </w:p>
-    <w:p>
-      <w:pPr>
-        <w:keepLines/>
-        <w:spacing w:before="20" w:after="200"/>
-        <w:ind w:left="500" w:right="500"/>
-        <w:pBdr>
-          <w:bottom w:val="double" w:sz="6" w:space="4" w:color="1F4D78"/>
-        </w:pBdr>
-      </w:pPr>
-      <w:r>
-        <w:rPr>
-          <w:rFonts w:ascii="Georgia" w:hAnsi="Georgia" w:cs="Georgia"/>
-          <w:b w:val="0"/>
-          <w:i/>
-          <w:color w:val="222222"/>
-          <w:sz w:val="19"/>
-        </w:rPr>
-        <w:t>The old tellings are gentle about the doors a hero leaves closed. A road not walked is not a road lost, the Circle says, only a road lent to someone else. Every path in these pages was true; a Guardian simply cannot be three heroes at once, and the year apart is the world's kind way of asking each of them who they most wish to become.</w:t>
-      </w:r>
-    </w:p>
-    <w:p>
-      <w:pPr>
-        <w:keepNext/>
-        <w:spacing w:before="120" w:after="40"/>
-        <w:jc w:val="center"/>
-      </w:pPr>
-      <w:r>
-        <w:drawing>
-          <wp:inline xmlns:a="http://schemas.openxmlformats.org/drawingml/2006/main" xmlns:pic="http://schemas.openxmlformats.org/drawingml/2006/picture">
-            <wp:extent cx="5303520" cy="3531260"/>
-            <wp:docPr id="4" name="Picture 4"/>
-            <wp:cNvGraphicFramePr>
-              <a:graphicFrameLocks noChangeAspect="1"/>
-            </wp:cNvGraphicFramePr>
-            <a:graphic>
-              <a:graphicData uri="http://schemas.openxmlformats.org/drawingml/2006/picture">
-                <pic:pic>
-                  <pic:nvPicPr>
-                    <pic:cNvPr id="0" name="image.jpg"/>
-                    <pic:cNvPicPr/>
-                  </pic:nvPicPr>
-                  <pic:blipFill>
-                    <a:blip r:embed="rId13"/>
-                    <a:stretch>
-                      <a:fillRect/>
-                    </a:stretch>
-                  </pic:blipFill>
-                  <pic:spPr>
-                    <a:xfrm>
-                      <a:off x="0" y="0"/>
-                      <a:ext cx="5303520" cy="3531260"/>
-                    </a:xfrm>
-                    <a:prstGeom prst="rect"/>
-                  </pic:spPr>
-                </pic:pic>
-              </a:graphicData>
-            </a:graphic>
-          </wp:inline>
-        </w:drawing>
-      </w:r>
-    </w:p>
-    <w:p>
-      <w:pPr>
-        <w:spacing w:after="140"/>
-        <w:jc w:val="center"/>
-      </w:pPr>
-      <w:r>
-        <w:rPr>
-          <w:rFonts w:ascii="Georgia" w:hAnsi="Georgia" w:cs="Georgia"/>
-          <w:i/>
-          <w:color w:val="888888"/>
-          <w:sz w:val="18"/>
-        </w:rPr>
-        <w:t>The parting at Gearhaven's gates: three friends, three roads, one year.</w:t>
-      </w:r>
-    </w:p>
-    <w:p>
-      <w:pPr>
-        <w:keepNext/>
         <w:pageBreakBefore/>
         <w:spacing w:before="400" w:after="120"/>
         <w:pBdr>
@@ -518,7 +146,7 @@
             <wp:extent cx="2011680" cy="2011680"/>
             <wp:effectExtent l="0" t="0" r="0" b="0"/>
             <wp:wrapSquare wrapText="bothSides"/>
-            <wp:docPr id="5" name="Picture 5"/>
+            <wp:docPr id="1" name="Picture 1"/>
             <wp:cNvGraphicFramePr/>
             <a:graphic xmlns:pic="http://schemas.openxmlformats.org/drawingml/2006/picture">
               <a:graphicData uri="http://schemas.openxmlformats.org/drawingml/2006/picture">
@@ -528,7 +156,7 @@
                     <pic:cNvPicPr/>
                   </pic:nvPicPr>
                   <pic:blipFill>
-                    <a:blip r:embed="rId14"/>
+                    <a:blip r:embed="rId10"/>
                     <a:stretch>
                       <a:fillRect/>
                     </a:stretch>
@@ -825,7 +453,7 @@
             <wp:extent cx="2194560" cy="2194560"/>
             <wp:effectExtent l="0" t="0" r="0" b="0"/>
             <wp:wrapSquare wrapText="bothSides"/>
-            <wp:docPr id="6" name="Picture 6"/>
+            <wp:docPr id="2" name="Picture 2"/>
             <wp:cNvGraphicFramePr/>
             <a:graphic xmlns:pic="http://schemas.openxmlformats.org/drawingml/2006/picture">
               <a:graphicData uri="http://schemas.openxmlformats.org/drawingml/2006/picture">
@@ -835,7 +463,7 @@
                     <pic:cNvPicPr/>
                   </pic:nvPicPr>
                   <pic:blipFill>
-                    <a:blip r:embed="rId15"/>
+                    <a:blip r:embed="rId11"/>
                     <a:stretch>
                       <a:fillRect/>
                     </a:stretch>
@@ -1298,7 +926,7 @@
             <wp:extent cx="2148840" cy="2148840"/>
             <wp:effectExtent l="0" t="0" r="0" b="0"/>
             <wp:wrapSquare wrapText="bothSides"/>
-            <wp:docPr id="7" name="Picture 7"/>
+            <wp:docPr id="3" name="Picture 3"/>
             <wp:cNvGraphicFramePr/>
             <a:graphic xmlns:pic="http://schemas.openxmlformats.org/drawingml/2006/picture">
               <a:graphicData uri="http://schemas.openxmlformats.org/drawingml/2006/picture">
@@ -1308,7 +936,7 @@
                     <pic:cNvPicPr/>
                   </pic:nvPicPr>
                   <pic:blipFill>
-                    <a:blip r:embed="rId16"/>
+                    <a:blip r:embed="rId12"/>
                     <a:stretch>
                       <a:fillRect/>
                     </a:stretch>

</xml_diff>

<commit_message>
Storm-Arc is always on; the Cell's charges are Thunder Wave + Counter-Bolt
Every Boomstick hit now arcs lightning to up to two creatures within
15 feet (Dex save, 2d6, half on success): the door's every-turn
signature. The Long Rest budget narrows to two Thunder Wave Rounds
and two Counter-Bolts. Compendium, handouts, and book rebuilt.

Co-Authored-By: Claude Opus 4.8 <noreply@anthropic.com>
</commit_message>
<xml_diff>
--- a/characters/path_rewards/glimmerstone_artifacts_v3.docx
+++ b/characters/path_rewards/glimmerstone_artifacts_v3.docx
@@ -523,7 +523,7 @@
           <w:color w:val="222222"/>
           <w:sz w:val="18"/>
         </w:rPr>
-        <w:t>Charged Rounds.</w:t>
+        <w:t>Storm-Arc.</w:t>
       </w:r>
       <w:r>
         <w:rPr>
@@ -533,7 +533,7 @@
           <w:color w:val="222222"/>
           <w:sz w:val="18"/>
         </w:rPr>
-        <w:t xml:space="preserve"> The Storm Cell holds two charged rounds of each kind below, and you regain all expended rounds when you finish a Long Rest. If a round requires a saving throw, the DC equals your spell save DC.</w:t>
+        <w:t xml:space="preserve"> The drum never stops humming. Whenever you hit a creature with Boomstick, lightning arcs from the target to up to two other creatures of your choice within 15 feet of it. Each must make a Dexterity saving throw against your spell save DC, taking 2d6 Lightning damage on a failed save, or half as much damage on a successful one.</w:t>
       </w:r>
     </w:p>
     <w:p>
@@ -553,7 +553,7 @@
           <w:color w:val="222222"/>
           <w:sz w:val="18"/>
         </w:rPr>
-        <w:t>Arc Round.</w:t>
+        <w:t>Charged Rounds.</w:t>
       </w:r>
       <w:r>
         <w:rPr>
@@ -563,7 +563,7 @@
           <w:color w:val="222222"/>
           <w:sz w:val="18"/>
         </w:rPr>
-        <w:t xml:space="preserve"> When you hit a creature with Boomstick, you can expend one Arc Round to make the shot leap: lightning arcs from the target to up to two other creatures of your choice within 15 feet of it. Each must make a Dexterity saving throw, taking 2d6 Lightning damage on a failed save, or half as much damage on a successful one.</w:t>
+        <w:t xml:space="preserve"> The Storm Cell holds two Thunder Wave Rounds and two Counter-Bolts, and you regain all expended rounds when you finish a Long Rest. If a round requires a saving throw, the DC equals your spell save DC.</w:t>
       </w:r>
     </w:p>
     <w:p>

</xml_diff>

<commit_message>
Path-reward handouts: drop the full titlepage cover, open on the content
Each handout was a mostly-empty cover page plus the hero's section. The section already leads with its own title h1, so the cover was a wasted page. Open the handout directly on that h1 (page break stripped). Lilly's handout drops 5 -> 4 pages; Stabby and Ursa each lose their cover too. Compendium unaffected (titlepage is handout-only).

Co-Authored-By: Claude Opus 4.8 <noreply@anthropic.com>
</commit_message>
<xml_diff>
--- a/characters/path_rewards/glimmerstone_artifacts_v3.docx
+++ b/characters/path_rewards/glimmerstone_artifacts_v3.docx
@@ -5,80 +5,7 @@
   <w:body>
     <w:p>
       <w:pPr>
-        <w:spacing w:before="480"/>
-        <w:jc w:val="center"/>
-      </w:pPr>
-      <w:r>
-        <w:rPr>
-          <w:rFonts w:ascii="Georgia" w:hAnsi="Georgia" w:cs="Georgia"/>
-          <w:color w:val="B8860B"/>
-          <w:sz w:val="32"/>
-        </w:rPr>
-        <w:t>✦  ✦  ✦</w:t>
-      </w:r>
-    </w:p>
-    <w:p>
-      <w:pPr>
-        <w:spacing w:before="360"/>
-        <w:jc w:val="center"/>
-      </w:pPr>
-      <w:r>
-        <w:rPr>
-          <w:rFonts w:ascii="Georgia" w:hAnsi="Georgia" w:cs="Georgia"/>
-          <w:b/>
-          <w:color w:val="222222"/>
-          <w:sz w:val="30"/>
-        </w:rPr>
-        <w:t>THE GUARDIANS OF ELARIA</w:t>
-      </w:r>
-    </w:p>
-    <w:p>
-      <w:pPr>
-        <w:jc w:val="center"/>
-      </w:pPr>
-      <w:r>
-        <w:rPr>
-          <w:rFonts w:ascii="Georgia" w:hAnsi="Georgia" w:cs="Georgia"/>
-          <w:b/>
-          <w:color w:val="B8860B"/>
-          <w:sz w:val="60"/>
-        </w:rPr>
-        <w:t>THE THREE DOORS: LILLY</w:t>
-      </w:r>
-    </w:p>
-    <w:p>
-      <w:pPr>
-        <w:jc w:val="center"/>
-      </w:pPr>
-      <w:r>
-        <w:rPr>
-          <w:rFonts w:ascii="Georgia" w:hAnsi="Georgia" w:cs="Georgia"/>
-          <w:b/>
-          <w:color w:val="A0522D"/>
-          <w:sz w:val="34"/>
-        </w:rPr>
-        <w:t>Glimmerstone Artifacts</w:t>
-      </w:r>
-    </w:p>
-    <w:p>
-      <w:pPr>
-        <w:spacing w:before="200" w:after="320"/>
-        <w:jc w:val="center"/>
-      </w:pPr>
-      <w:r>
-        <w:rPr>
-          <w:rFonts w:ascii="Georgia" w:hAnsi="Georgia" w:cs="Georgia"/>
-          <w:i/>
-          <w:color w:val="888888"/>
-          <w:sz w:val="19"/>
-        </w:rPr>
-        <w:t>A player handout for The Guardians of Elaria. Choose your door with open eyes.</w:t>
-      </w:r>
-    </w:p>
-    <w:p>
-      <w:pPr>
         <w:keepNext/>
-        <w:pageBreakBefore/>
         <w:spacing w:before="400" w:after="120"/>
         <w:pBdr>
           <w:bottom w:val="single" w:sz="6" w:space="4" w:color="B8860B"/>

</xml_diff>